<commit_message>
Correct software engineering enchancement narrative
</commit_message>
<xml_diff>
--- a/artifacts/software-design-engineering/software-design-engineering-narrative.docx
+++ b/artifacts/software-design-engineering/software-design-engineering-narrative.docx
@@ -2,33 +2,35 @@
 <file path=word/document.xml><?xml version="1.0" encoding="utf-8"?>
 <w:document xmlns:wpc="http://schemas.microsoft.com/office/word/2010/wordprocessingCanvas" xmlns:cx="http://schemas.microsoft.com/office/drawing/2014/chartex" xmlns:cx1="http://schemas.microsoft.com/office/drawing/2015/9/8/chartex" xmlns:cx2="http://schemas.microsoft.com/office/drawing/2015/10/21/chartex" xmlns:cx3="http://schemas.microsoft.com/office/drawing/2016/5/9/chartex" xmlns:cx4="http://schemas.microsoft.com/office/drawing/2016/5/10/chartex" xmlns:cx5="http://schemas.microsoft.com/office/drawing/2016/5/11/chartex" xmlns:cx6="http://schemas.microsoft.com/office/drawing/2016/5/12/chartex" xmlns:cx7="http://schemas.microsoft.com/office/drawing/2016/5/13/chartex" xmlns:cx8="http://schemas.microsoft.com/office/drawing/2016/5/14/chartex" xmlns:mc="http://schemas.openxmlformats.org/markup-compatibility/2006" xmlns:aink="http://schemas.microsoft.com/office/drawing/2016/ink" xmlns:am3d="http://schemas.microsoft.com/office/drawing/2017/model3d" xmlns:o="urn:schemas-microsoft-com:office:office" xmlns:oel="http://schemas.microsoft.com/office/2019/extlst" xmlns:r="http://schemas.openxmlformats.org/officeDocument/2006/relationships" xmlns:m="http://schemas.openxmlformats.org/officeDocument/2006/math" xmlns:v="urn:schemas-microsoft-com:vml" xmlns:wp14="http://schemas.microsoft.com/office/word/2010/wordprocessingDrawing" xmlns:wp="http://schemas.openxmlformats.org/drawingml/2006/wordprocessingDrawing" xmlns:w10="urn:schemas-microsoft-com:office:word" xmlns:w="http://schemas.openxmlformats.org/wordprocessingml/2006/main" xmlns:w14="http://schemas.microsoft.com/office/word/2010/wordml" xmlns:w15="http://schemas.microsoft.com/office/word/2012/wordml" xmlns:w16cex="http://schemas.microsoft.com/office/word/2018/wordml/cex" xmlns:w16cid="http://schemas.microsoft.com/office/word/2016/wordml/cid" xmlns:w16="http://schemas.microsoft.com/office/word/2018/wordml" xmlns:w16du="http://schemas.microsoft.com/office/word/2023/wordml/word16du" xmlns:w16sdtdh="http://schemas.microsoft.com/office/word/2020/wordml/sdtdatahash" xmlns:w16sdtfl="http://schemas.microsoft.com/office/word/2024/wordml/sdtformatlock" xmlns:w16se="http://schemas.microsoft.com/office/word/2015/wordml/symex" xmlns:wpg="http://schemas.microsoft.com/office/word/2010/wordprocessingGroup" xmlns:wpi="http://schemas.microsoft.com/office/word/2010/wordprocessingInk" xmlns:wne="http://schemas.microsoft.com/office/word/2006/wordml" xmlns:wps="http://schemas.microsoft.com/office/word/2010/wordprocessingShape" mc:Ignorable="w14 w15 w16se w16cid w16 w16cex w16sdtdh w16sdtfl w16du wp14">
   <w:body>
-    <w:p/>
-    <w:p/>
     <w:p>
       <w:pPr>
         <w:rPr>
           <w:b/>
           <w:bCs/>
+          <w:u w:val="single"/>
         </w:rPr>
       </w:pPr>
-      <w:r>
-        <w:t xml:space="preserve">                                                    </w:t>
-      </w:r>
-      <w:r>
+    </w:p>
+    <w:p>
+      <w:pPr>
         <w:rPr>
           <w:b/>
           <w:bCs/>
           <w:u w:val="single"/>
         </w:rPr>
-        <w:t>M</w:t>
-      </w:r>
+      </w:pPr>
+    </w:p>
+    <w:p>
+      <w:pPr>
+        <w:ind w:firstLine="720"/>
+      </w:pPr>
       <w:r>
         <w:rPr>
           <w:b/>
           <w:bCs/>
           <w:u w:val="single"/>
         </w:rPr>
-        <w:t>ilestone Four: Databases</w:t>
+        <w:t>Milestone Two: Software Design and Engineering Enhancement Narrative</w:t>
       </w:r>
       <w:r>
         <w:rPr>
@@ -36,12 +38,14 @@
           <w:bCs/>
           <w:u w:val="single"/>
         </w:rPr>
-        <w:t xml:space="preserve"> Narrative</w:t>
-      </w:r>
-      <w:r>
         <w:br/>
       </w:r>
       <w:r>
+        <w:rPr>
+          <w:b/>
+          <w:bCs/>
+          <w:u w:val="single"/>
+        </w:rPr>
         <w:br/>
       </w:r>
       <w:r>
@@ -53,117 +57,44 @@
         </w:rPr>
         <w:t>Artifact Description</w:t>
       </w:r>
-    </w:p>
-    <w:p>
-      <w:r>
-        <w:t xml:space="preserve">The artifact selected for the Databases category is </w:t>
-      </w:r>
-      <w:r>
-        <w:t xml:space="preserve">once again </w:t>
-      </w:r>
-      <w:r>
-        <w:t xml:space="preserve">the </w:t>
-      </w:r>
-      <w:proofErr w:type="spellStart"/>
-      <w:r>
-        <w:t>Travlr</w:t>
-      </w:r>
-      <w:proofErr w:type="spellEnd"/>
-      <w:r>
-        <w:t xml:space="preserve"> Getaways full-stack web application that I originally developed during CS 465: Full Stack Development in the summer of 2026 and completed in August, with additional enhancements completed during the previous modules of the capstone</w:t>
-      </w:r>
-      <w:r>
-        <w:t xml:space="preserve"> course</w:t>
-      </w:r>
-      <w:r>
-        <w:t xml:space="preserve">. The project was based on a Full Stack Guide issued to students, which tasked us with modifying and improving existing work on a JavaScript web portal. </w:t>
-      </w:r>
-      <w:proofErr w:type="spellStart"/>
-      <w:r>
-        <w:t>Travlr</w:t>
-      </w:r>
-      <w:proofErr w:type="spellEnd"/>
-      <w:r>
-        <w:t xml:space="preserve"> uses the MEAN stack, including MongoDB, Express, Angular, and Node.js, to provide a customer-facing travel website and an administrative single-page application for managing trip information. I selected this artifact for the Databases category because MongoDB serves as the persistent data store for the application's trip records, while Mongoose provides the schema and database access used by the API. This provided an opportunity to improve how the application validates, stores, retrieves, and protects its trip data.</w:t>
-      </w:r>
-    </w:p>
-    <w:p>
-      <w:r>
-        <w:t xml:space="preserve">For this enhancement, I strengthened the existing Mongoose schema validation, improved database indexing, and refined the queries used to retrieve and update trip records. The trip code was configured as a unique indexed value to prevent </w:t>
-      </w:r>
-      <w:proofErr w:type="gramStart"/>
-      <w:r>
-        <w:t>duplicate</w:t>
-      </w:r>
-      <w:proofErr w:type="gramEnd"/>
-      <w:r>
-        <w:t xml:space="preserve"> records, while an</w:t>
-      </w:r>
-      <w:r>
-        <w:t xml:space="preserve"> </w:t>
-      </w:r>
-      <w:r>
-        <w:t>index on the trip name</w:t>
-      </w:r>
-      <w:r>
-        <w:t xml:space="preserve"> itself</w:t>
-      </w:r>
-      <w:r>
-        <w:t xml:space="preserve"> was removed. I also changed the query used to retrieve an individual trip from </w:t>
-      </w:r>
-      <w:proofErr w:type="gramStart"/>
-      <w:r>
-        <w:t>find(</w:t>
-      </w:r>
-      <w:proofErr w:type="gramEnd"/>
-      <w:r>
-        <w:t xml:space="preserve">) to </w:t>
-      </w:r>
-      <w:proofErr w:type="spellStart"/>
-      <w:proofErr w:type="gramStart"/>
-      <w:r>
-        <w:t>findOne</w:t>
-      </w:r>
-      <w:proofErr w:type="spellEnd"/>
-      <w:r>
-        <w:t>(</w:t>
-      </w:r>
-      <w:proofErr w:type="gramEnd"/>
-      <w:r>
-        <w:t>), allowing the API to treat the unique trip code as a single-record lookup and correctly return a not-found response when no matching trip exists. Validation was extended to update operations so that invalid data is rejected before being persisted, and the administrative interface was updated to display useful validation and duplicate-code messages when database operations fail</w:t>
-      </w:r>
-      <w:r>
-        <w:t xml:space="preserve"> instead of </w:t>
-      </w:r>
-      <w:proofErr w:type="gramStart"/>
-      <w:r>
-        <w:t>merely not</w:t>
-      </w:r>
-      <w:proofErr w:type="gramEnd"/>
-      <w:r>
-        <w:t xml:space="preserve"> proceeding to the next page or displaying a generic message</w:t>
-      </w:r>
-      <w:r>
-        <w:t xml:space="preserve">. Together, these changes improve the integrity and reliability of the application's stored trip information while preserving the existing architecture of the </w:t>
-      </w:r>
-      <w:proofErr w:type="spellStart"/>
-      <w:r>
-        <w:t>Travlr</w:t>
-      </w:r>
-      <w:proofErr w:type="spellEnd"/>
-      <w:r>
-        <w:t xml:space="preserve"> application.</w:t>
-      </w:r>
-    </w:p>
-    <w:p>
-      <w:pPr>
+      <w:r>
         <w:rPr>
           <w:b/>
           <w:bCs/>
           <w:i/>
           <w:iCs/>
         </w:rPr>
-      </w:pPr>
+        <w:br/>
+      </w:r>
+      <w:r>
+        <w:rPr>
+          <w:b/>
+          <w:bCs/>
+          <w:i/>
+          <w:iCs/>
+        </w:rPr>
+        <w:br/>
+      </w:r>
+      <w:r>
+        <w:t xml:space="preserve">The artifact I selected for this enhancement is Travlr Getaways, a full-stack web application that I originally developed during CS 465: Full Stack Development in the summer of 2026 and completed in August. The project was based on a Full </w:t>
+      </w:r>
+      <w:r>
+        <w:t>Stack</w:t>
+      </w:r>
+      <w:r>
+        <w:t xml:space="preserve"> Guide issued to students, which tasked us with modifying and improving existing work on a JavaScript web portal. The application was developed using the MEAN stack, incorporating MongoDB, Express, Angular, and Node.js. Travlr includes both a customer-facing website for viewing available trips and an administrative single-page application that allows authenticated users to manage trip information stored in the database. The original project provided functionality for retrieving, adding, and updating trip records, along with JSON Web Token (JWT) authentication for protecting administrative functionality.</w:t>
+      </w:r>
+    </w:p>
+    <w:p>
+      <w:r>
+        <w:t>For my CS 499 software design and engineering enhancement, I expanded the administrative functionality by implementing the missing delete operation needed to complete the application's CRUD capabilities. Though delete functionality was not required by the course guidelines for CS 465, I felt this was a glaring omission and therefore would make a perfect addition to the project for the purposes of the CS 499 Capstone course. The enhancement allows an authenticated administrator to delete an existing trip through the Angular interface while requiring confirmation before the request is submitted. The deletion process extends through the Angular components and service, the Express API and authentication middleware, and the Mongoose controller responsible for removing the corresponding record from MongoDB.</w:t>
+      </w:r>
+      <w:r>
+        <w:br/>
+      </w:r>
+      <w:r>
+        <w:br/>
+      </w:r>
       <w:r>
         <w:rPr>
           <w:b/>
@@ -173,119 +104,72 @@
         </w:rPr>
         <w:t>Justification and Enhancement</w:t>
       </w:r>
-    </w:p>
-    <w:p>
-      <w:r>
-        <w:t xml:space="preserve">The original </w:t>
-      </w:r>
-      <w:proofErr w:type="spellStart"/>
-      <w:r>
-        <w:t>Travlr</w:t>
-      </w:r>
-      <w:proofErr w:type="spellEnd"/>
-      <w:r>
-        <w:t xml:space="preserve"> application used a Mongoose schema to define the structure of trip records, but the database layer provided limited validation beyond requiring the individual fields. I enhanced the schema by trimming string values, normalizing trip codes to uppercase, and adding validation to the </w:t>
-      </w:r>
-      <w:proofErr w:type="spellStart"/>
-      <w:r>
-        <w:t>perPerson</w:t>
-      </w:r>
-      <w:proofErr w:type="spellEnd"/>
-      <w:r>
-        <w:t xml:space="preserve"> field so that invalid monetary values are </w:t>
-      </w:r>
-      <w:r>
-        <w:lastRenderedPageBreak/>
-        <w:t xml:space="preserve">rejected before they can be stored. I also configured </w:t>
-      </w:r>
-      <w:proofErr w:type="gramStart"/>
-      <w:r>
-        <w:t>update</w:t>
-      </w:r>
-      <w:proofErr w:type="gramEnd"/>
-      <w:r>
-        <w:t xml:space="preserve"> operations to run the same schema validators used when new records are created. This was important because validation during record creation alone would still allow an existing valid record to be changed to contain invalid data. During implementation, I considered </w:t>
-      </w:r>
-      <w:proofErr w:type="gramStart"/>
-      <w:r>
-        <w:t xml:space="preserve">changing </w:t>
-      </w:r>
-      <w:proofErr w:type="spellStart"/>
-      <w:r>
-        <w:t>perPerson</w:t>
-      </w:r>
-      <w:proofErr w:type="spellEnd"/>
-      <w:proofErr w:type="gramEnd"/>
-      <w:r>
-        <w:t xml:space="preserve"> from a string to a numeric data type, which would provide advantages for future numeric queries and calculations. However, that change would have affected multiple existing application layers and introduced additional migration and regression concerns. I therefore retained the existing data type while strengthening its validation, allowing the enhancement to improve data integrity </w:t>
-      </w:r>
-      <w:r>
-        <w:t xml:space="preserve">without requiring </w:t>
-      </w:r>
-      <w:proofErr w:type="gramStart"/>
-      <w:r>
-        <w:t>an unnecessary redesign of</w:t>
-      </w:r>
-      <w:proofErr w:type="gramEnd"/>
-      <w:r>
-        <w:t xml:space="preserve"> otherwise functional portions of the application, which would have been excessively time consuming for the demising returns it would provide for the purposes of this project</w:t>
-      </w:r>
-      <w:r>
-        <w:t>.</w:t>
-      </w:r>
-    </w:p>
-    <w:p>
-      <w:r>
-        <w:t xml:space="preserve">I also revised the database indexes and query design to better reflect how trip records are </w:t>
-      </w:r>
-      <w:proofErr w:type="gramStart"/>
-      <w:r>
-        <w:t>actually accessed</w:t>
-      </w:r>
-      <w:proofErr w:type="gramEnd"/>
-      <w:r>
-        <w:t xml:space="preserve">. The trip code serves as the application's unique identifier for individual trips, so I configured its MongoDB index to enforce uniqueness and verified the existing records before applying that constraint. An existing index on the trip name field was removed because the application does not use that field for database-level lookups that would justify maintaining the additional index. This reduces unnecessary index maintenance while retaining an index that directly supports the application's access pattern and data-integrity requirements. I also changed the individual-trip lookup from </w:t>
-      </w:r>
-      <w:proofErr w:type="gramStart"/>
-      <w:r>
-        <w:t>find(</w:t>
-      </w:r>
-      <w:proofErr w:type="gramEnd"/>
-      <w:r>
-        <w:t xml:space="preserve">) to </w:t>
-      </w:r>
-      <w:proofErr w:type="spellStart"/>
-      <w:proofErr w:type="gramStart"/>
-      <w:r>
-        <w:t>findOne</w:t>
-      </w:r>
-      <w:proofErr w:type="spellEnd"/>
-      <w:r>
-        <w:t>(</w:t>
-      </w:r>
-      <w:proofErr w:type="gramEnd"/>
-      <w:r>
-        <w:t>). Because a trip code uniquely identifies a single record, returning one document more accurately represents the intended query than returning an array. This also improved error handling because a nonexistent code now produces a null result that the API can recognize and return as an HTTP 404 response instead of treating an empty array as a successful lookup.</w:t>
-      </w:r>
-    </w:p>
-    <w:p>
-      <w:r>
-        <w:t xml:space="preserve">Additional changes were required to ensure that the administrative interface worked correctly with the strengthened database rules. Duplicate trip codes are rejected by MongoDB's unique index, and the API translates the resulting duplicate-key error into a useful message that can be displayed to the administrator. Database validation errors are handled similarly so that invalid updates remain unsuccessful while the user receives an explanation of why the operation failed. I also modified the update process to preserve the original trip code separately from the potentially edited code submitted by the form. Previously, the editable code was also used to construct the API request that identified which record should be updated. Separating the original identifier from the proposed new value ensures that the API updates the intended document and allows the unique database index to correctly evaluate an attempted code change. These supporting changes </w:t>
-      </w:r>
-      <w:r>
-        <w:lastRenderedPageBreak/>
-        <w:t>allow the database constraints to protect the stored information while providing predictable behavior through the administrative interface.</w:t>
-      </w:r>
-    </w:p>
-    <w:p>
-      <w:pPr>
+      <w:r>
         <w:rPr>
           <w:b/>
           <w:bCs/>
           <w:i/>
           <w:iCs/>
         </w:rPr>
-      </w:pPr>
+        <w:br/>
+      </w:r>
+      <w:r>
+        <w:rPr>
+          <w:b/>
+          <w:bCs/>
+          <w:i/>
+          <w:iCs/>
+        </w:rPr>
+        <w:br/>
+      </w:r>
+      <w:r>
+        <w:t>I selected Travlr Getaways for inclusion in my ePortfolio because it demonstrates my ability to work with multiple components of a full-stack application rather than focusing on only one area of software development. The project requires the frontend interface, backend API, authentication system, and database to work together, making it</w:t>
+      </w:r>
+      <w:r>
+        <w:t xml:space="preserve"> some</w:t>
+      </w:r>
+      <w:r>
+        <w:t>thing</w:t>
+      </w:r>
+      <w:r>
+        <w:t xml:space="preserve"> of a development sampler platter, if you will, and therefore a </w:t>
+      </w:r>
+      <w:r>
+        <w:t>useful</w:t>
+      </w:r>
+      <w:r>
+        <w:t xml:space="preserve"> overall </w:t>
+      </w:r>
+      <w:r>
+        <w:t xml:space="preserve">representation of the software design and engineering skills I developed throughout the Computer Science </w:t>
+      </w:r>
+      <w:r>
+        <w:lastRenderedPageBreak/>
+        <w:t>program. I also felt that revisiting an existing project provided an opportunity to demonstrate my ability to evaluate previous work, identify an area that could be improved, and extend the application without unnecessarily redesigning functionality that was already working correctly.</w:t>
+      </w:r>
+    </w:p>
+    <w:p>
+      <w:r>
+        <w:t>The addition of delete functionality improved the administrative portion of Travlr by completing its CRUD capabilities. I implemented the enhancement across several layers of the application rather than treating deletion as only a database operation. The Angular interface now provides authenticated users with a Delete Trip control and requires confirmation before proceeding with a destructive action. I used an event emitter to pass the confirmed delete request from the individual trip card to the parent trip listing component, allowing the listing component to remain responsible for managing the collection of trips. The Angular data service then sends the request to the existing REST API, maintaining the separation between interface components and API communication.</w:t>
+      </w:r>
+    </w:p>
+    <w:p>
+      <w:r>
+        <w:t>Security was also an important consideration when implementing the enhancement. Hiding the Delete Trip control from users who are not logged in improves the interface, but I did not rely on this as the security mechanism. The Express DELETE route uses the application's existing JWT authentication middleware, requiring a valid token before the request can reach the controller and database. The controller uses Mongoose to locate and delete the requested trip and provides different HTTP responses for a successful deletion, a trip that cannot be found, and an unexpected server error. This approach improved the artifact while remaining consistent with the architecture and authentication methods already established in the original application.</w:t>
+      </w:r>
+    </w:p>
+    <w:p>
+      <w:r>
+        <w:t xml:space="preserve">I tested the completed enhancement through both Postman and the Angular interface. Testing included requests with valid, invalid, and missing authentication, attempts to delete a nonexistent trip, cancellation of a deletion through the confirmation prompt, and successful deletion of temporary test records. After </w:t>
+      </w:r>
+      <w:r>
+        <w:t xml:space="preserve">creating and then subsequently </w:t>
+      </w:r>
+      <w:r>
+        <w:t>deleting a test trip through the interface, I refreshed the application to verify that the record remained absent, confirming that the change had persisted in MongoDB rather than only being removed from the displayed Angular data. These tests helped demonstrate that the enhancement worked across the complete application rather than only at an individual layer.</w:t>
+      </w:r>
+    </w:p>
+    <w:p>
       <w:r>
         <w:rPr>
           <w:b/>
@@ -295,58 +179,43 @@
         </w:rPr>
         <w:t>Course Outcomes</w:t>
       </w:r>
-    </w:p>
-    <w:p>
-      <w:r>
-        <w:t xml:space="preserve">This enhancement primarily supports Course Outcome 4, which focuses on using well-founded and innovative techniques, skills, and tools to implement computing solutions that deliver value and accomplish industry-specific goals. Improving the </w:t>
-      </w:r>
-      <w:proofErr w:type="spellStart"/>
-      <w:r>
-        <w:t>Travlr</w:t>
-      </w:r>
-      <w:proofErr w:type="spellEnd"/>
-      <w:r>
-        <w:t xml:space="preserve"> database required me to work with MongoDB and Mongoose at both the schema and query levels rather than treating the database only as a location for storing application data. I strengthened validation rules, configured a unique index around the trip code used to identify records, removed an index that was not justified by the application's query patterns, and revised the individual-record query to better represent the expected result. These changes improved the reliability of the application's data while continuing to use the database technologies and architecture already established by the MEAN application.</w:t>
-      </w:r>
-    </w:p>
-    <w:p>
-      <w:r>
-        <w:t>The enhancement also supports Course Outcome 5 by applying a security mindset to the integrity of data stored and modified by the application. Schema validation prevents malformed price values from being persisted, while the unique trip-code index prevents records from violating an important data constraint. I also configured update operations to run schema validation so that these protections apply not only when records are created, but when existing information is modified. Testing the administrative interface revealed that database constraints alone were not sufficient if the application did not correctly identify the record being updated. Preserving the original trip code separately from a proposed new value ensured that an update continued to target the intended record and allowed the unique database constraint to reject conflicting changes. Together, these changes reduce opportunities for invalid or conflicting information to enter the database and help preserve the integrity of application resources.</w:t>
-      </w:r>
-    </w:p>
-    <w:p>
-      <w:r>
-        <w:t xml:space="preserve">The completed enhancement remained consistent with the database plan established earlier in the course, although testing led to several refinements in how the plan was implemented. The original goals included improving validation, indexing, and query design, all of which were completed. During development, I also added user-facing error handling for failed database operations and revised how the application identifies a record during an update. I considered broader changes, including converting the existing </w:t>
-      </w:r>
-      <w:proofErr w:type="spellStart"/>
-      <w:r>
-        <w:t>perPerson</w:t>
-      </w:r>
-      <w:proofErr w:type="spellEnd"/>
-      <w:r>
-        <w:t xml:space="preserve"> field from a string to a numeric type</w:t>
-      </w:r>
-      <w:r>
-        <w:t xml:space="preserve"> as referenced earlier</w:t>
-      </w:r>
-      <w:r>
-        <w:t xml:space="preserve">, but determined that the additional migration and application changes were not necessary to accomplish the goals of this enhancement. This allowed me to improve the database design and integrity while limiting </w:t>
-      </w:r>
-      <w:r>
-        <w:lastRenderedPageBreak/>
-        <w:t>changes that could introduce unnecessary complexity or regressions elsewhere in the application.</w:t>
-      </w:r>
-    </w:p>
-    <w:p/>
-    <w:p>
-      <w:pPr>
+      <w:r>
         <w:rPr>
           <w:b/>
           <w:bCs/>
           <w:i/>
           <w:iCs/>
         </w:rPr>
-      </w:pPr>
+        <w:br/>
+      </w:r>
+      <w:r>
+        <w:rPr>
+          <w:b/>
+          <w:bCs/>
+          <w:i/>
+          <w:iCs/>
+        </w:rPr>
+        <w:br/>
+      </w:r>
+      <w:r>
+        <w:t xml:space="preserve">I believe this enhancement successfully made progress toward the course outcomes I originally intended to address. The strongest connection is to the fourth course outcome, </w:t>
+      </w:r>
+      <w:r>
+        <w:lastRenderedPageBreak/>
+        <w:t>which focuses on using well-founded techniques, skills, and tools to implement computing solutions that deliver value and accomplish industry-specific goals. Completing the delete functionality required me to work across the existing MEAN application and use Angular components and services, an Express REST API, JWT authentication, Mongoose, and MongoDB together to implement a practical improvement to the application. Rather than replacing the existing architecture, I extended it in a manner that remained consistent with the design patterns already being used.</w:t>
+      </w:r>
+    </w:p>
+    <w:p>
+      <w:r>
+        <w:t>The enhancement also made meaningful progress toward the fifth course outcome concerning the development of a security mindset. Because deleting database records is a destructive operation, I wanted to ensure that the feature could not be accessed simply by bypassing the Angular interface. Although the Delete Trip button is only displayed to authenticated users, the backend route independently requires a valid JWT before allowing the delete controller to execute. Testing the endpoint with missing and invalid authentication helped verify that this protection was enforced by the server rather than only through the user interface.</w:t>
+      </w:r>
+    </w:p>
+    <w:p>
+      <w:r>
+        <w:t>There is also some connection to the third course outcome through the design choices and trade-offs involved in implementing the enhancement. For example, I chose to have the individual trip card emit a confirmed deletion request to its parent listing component rather than placing API and collection-management responsibilities directly within each card. After a successful response from the server, the displayed trip collection is updated locally rather than immediately requesting the entire collection from the database again. However, I plan to address the algorithmic portion of this outcome more directly through my upcoming Algorithms and Data Structures enhancement, which will add filtering and sorting functionality to Travlr. As a result, I do not currently see a need to substantially change my original outcome-coverage plan.</w:t>
+      </w:r>
+    </w:p>
+    <w:p>
       <w:r>
         <w:rPr>
           <w:b/>
@@ -356,73 +225,125 @@
         </w:rPr>
         <w:t>Enhancement Reflection</w:t>
       </w:r>
+      <w:r>
+        <w:rPr>
+          <w:b/>
+          <w:bCs/>
+          <w:i/>
+          <w:iCs/>
+        </w:rPr>
+        <w:br/>
+      </w:r>
+      <w:r>
+        <w:rPr>
+          <w:b/>
+          <w:bCs/>
+          <w:i/>
+          <w:iCs/>
+        </w:rPr>
+        <w:br/>
+      </w:r>
+      <w:r>
+        <w:t xml:space="preserve">Enhancing Travlr gave me a better understanding of what is involved in modifying an existing full-stack application rather than developing a feature in isolation. Although adding the ability to delete a trip initially appeared to be a relatively straightforward enhancement, implementing it properly </w:t>
+      </w:r>
+      <w:r>
+        <w:t>required changes across several interconnected parts of the application, spanning multiple source files and requiring man</w:t>
+      </w:r>
+      <w:r>
+        <w:t>y</w:t>
+      </w:r>
+      <w:r>
+        <w:t xml:space="preserve"> of </w:t>
+      </w:r>
+      <w:r>
+        <w:t>the</w:t>
+      </w:r>
+      <w:r>
+        <w:t xml:space="preserve"> supporting applications originally used during the development of Travlr</w:t>
+      </w:r>
+      <w:r>
+        <w:t xml:space="preserve">. I had to trace how data moved between the Angular interface, components and services, the Express API, authentication middleware, Mongoose, and MongoDB. This reinforced the importance of </w:t>
+      </w:r>
+      <w:r>
+        <w:lastRenderedPageBreak/>
+        <w:t>understanding an application's existing architecture before making changes to it. It was often more appropriate to extend patterns that were already working than to introduce an entirely new approach simply to implement one additional feature.</w:t>
+      </w:r>
     </w:p>
     <w:p>
-      <w:proofErr w:type="gramStart"/>
-      <w:r>
-        <w:t>The database</w:t>
-      </w:r>
-      <w:proofErr w:type="gramEnd"/>
-      <w:r>
-        <w:t xml:space="preserve"> enhancement reinforced the importance of treating data validation as a responsibility shared across multiple layers of an application. Adding validation rules to the Mongoose schema was relatively straightforward, but testing demonstrated that defining a rule does not by itself guarantee consistent behavior throughout every database operation. I tested both the creation and update paths with valid and invalid values to verify that the schema rules were being enforced before data </w:t>
-      </w:r>
-      <w:proofErr w:type="gramStart"/>
-      <w:r>
-        <w:t>was persisted</w:t>
-      </w:r>
-      <w:proofErr w:type="gramEnd"/>
-      <w:r>
-        <w:t xml:space="preserve">. Update operations required the additional </w:t>
-      </w:r>
-      <w:proofErr w:type="spellStart"/>
-      <w:r>
-        <w:t>runValidators</w:t>
-      </w:r>
-      <w:proofErr w:type="spellEnd"/>
-      <w:r>
-        <w:t xml:space="preserve"> option so that modifications to existing records were subject to the same validation expectations as newly created records. I also added error handling to the Angular administrative interface so that rejected operations produced useful feedback rather than simply failing without an explanation. This helped me better understand the relationship between database constraints, API responses, and the user interface that initiates the operation.</w:t>
+      <w:r>
+        <w:t>One of the more important lessons from this enhancement involved the separation of responsibilities between different layers of the application. The trip card is responsible for presenting an individual trip and requesting confirmation from the user, while the parent listing component manages the collection of trips and communicates with the data service. Likewise, the Angular interface determines whether the Delete Trip control should be displayed, while the backend remains responsible for actually enforcing authentication. This distinction was particularly important from a security perspective because</w:t>
+      </w:r>
+      <w:r>
+        <w:t xml:space="preserve"> simply</w:t>
+      </w:r>
+      <w:r>
+        <w:t xml:space="preserve"> hiding a button in the user interface</w:t>
+      </w:r>
+      <w:r>
+        <w:t>, although helpful,</w:t>
+      </w:r>
+      <w:r>
+        <w:t xml:space="preserve"> does not prevent someone from sending a request directly to the API. Requiring JWT authentication on the Express DELETE route ensured that authorization was enforced regardless of how the endpoint was accessed.</w:t>
       </w:r>
     </w:p>
     <w:p>
       <w:r>
-        <w:t>One of the most significant challenges appeared while testing the unique trip-code constraint. I attempted to change the code of a temporary test record to a code that already belonged to another trip, expecting MongoDB's unique index to reject the operation. Instead, testing revealed that the editable code from the form was also being used to construct the API request that identified the record to update. As a result, changing the code caused the request to target the record that already possessed the proposed code rather than the temporary record being edited. I corrected this by preserving the original trip code when the edit page loads and passing that value separately to the update service. The original code can therefore identify the intended database record while the code contained in the form represents the proposed new value. Repeating the duplicate-code test then allowed MongoDB's unique index to reject the conflicting change as intended. This experience demonstrated how a database constraint can be correctly configured while still failing to provide the expected application behavior if another layer of the system interacts with it incorrectly.</w:t>
+        <w:t xml:space="preserve">I also encountered several challenges that demonstrated the importance of incremental testing while modifying an existing application. During development, a minor quotation-mark error in the Angular template prevented the application from compiling, while another quotation issue caused the confirmation message to display a variable name rather than the actual trip name. </w:t>
+      </w:r>
+      <w:r>
+        <w:t>These were relatively small errors, but they reinforced how easily minor syntax problems can affect otherwise correct functionality and raised an interesting question about whether auto-completion features in program</w:t>
+      </w:r>
+      <w:r>
+        <w:t>s</w:t>
+      </w:r>
+      <w:r>
+        <w:t xml:space="preserve"> such as Visual studio Code can occasionally become more of a hindrance than a help, particularly for those of us who are accustomed to typing syntax manually</w:t>
+      </w:r>
+      <w:r>
+        <w:t xml:space="preserve">. </w:t>
+      </w:r>
+      <w:r>
+        <w:t>When it came time to verify my work, t</w:t>
+      </w:r>
+      <w:r>
+        <w:t>esting the backend separately through Postman was particularly useful because it allowed me to verify the API, authentication requirements, HTTP responses, and database behavior independently before relying entirely on the Angular interface.</w:t>
       </w:r>
     </w:p>
     <w:p>
       <w:r>
-        <w:t xml:space="preserve">Testing also uncovered smaller integration issues that required investigation across the application stack. Validation failures were correctly returned by the API, but the Angular interface did not initially display the resulting message until change detection was explicitly triggered. I also found that changing the individual-trip query from </w:t>
-      </w:r>
-      <w:proofErr w:type="gramStart"/>
-      <w:r>
-        <w:t>find(</w:t>
-      </w:r>
-      <w:proofErr w:type="gramEnd"/>
-      <w:r>
-        <w:t xml:space="preserve">) to </w:t>
-      </w:r>
-      <w:proofErr w:type="spellStart"/>
-      <w:proofErr w:type="gramStart"/>
-      <w:r>
-        <w:t>findOne</w:t>
-      </w:r>
-      <w:proofErr w:type="spellEnd"/>
-      <w:r>
-        <w:t>(</w:t>
-      </w:r>
-      <w:proofErr w:type="gramEnd"/>
-      <w:r>
-        <w:t xml:space="preserve">) altered </w:t>
+        <w:t>Despite some minor setbacks during development, this enhancement</w:t>
+      </w:r>
+      <w:r>
+        <w:t xml:space="preserve"> gave me additional experience working through the complete lifecycle of a feature, from identifying a limitation in an existing application through designing, implementing, debugging, and testing a solution. </w:t>
+      </w:r>
+      <w:r>
+        <w:t xml:space="preserve">Completing the missing CRUD operation improved the usefulness of the administrative interface and arguably helped move the application closer to what I would consider a more complete implementation, extending it beyond the functionality that had been required </w:t>
+      </w:r>
+      <w:r>
+        <w:t xml:space="preserve">for </w:t>
+      </w:r>
+      <w:r>
+        <w:t>the original CS 465 submission</w:t>
+      </w:r>
+      <w:r>
+        <w:t>.</w:t>
+      </w:r>
+      <w:r>
+        <w:t xml:space="preserve"> </w:t>
+      </w:r>
+      <w:r>
+        <w:t>However,</w:t>
+      </w:r>
+      <w:r>
+        <w:t xml:space="preserve"> I feel the greater value of the enhancement was learning how to make a focused change without unnecessarily disrupting functionality that was already working. This experience is particularly relevant to </w:t>
       </w:r>
       <w:r>
         <w:lastRenderedPageBreak/>
-        <w:t>the shape of the API response from an array to a single object, requiring the Angular service and edit component to be updated accordingly. After completing these changes, I performed regression testing on valid edits, database contents, the filtering and sorting functionality from the previous enhancement, and the authenticated DELETE functionality developed earlier in the capstone. This process reinforced the value of incremental testing because even a database-focused improvement can affect API contracts and user-interface behavior elsewhere in a full-stack application.</w:t>
+        <w:t>maintaining and improving existing software, where understanding the current design and making controlled changes can be just as important as developing new functionality from scratch.</w:t>
       </w:r>
     </w:p>
-    <w:p>
-      <w:r>
-        <w:t>I feel it would be safe to say that through experimentation and troubleshooting, this enhancement improved my understanding of database design as more than simply creating collections and performing basic CRUD operations. Decisions involving validation, indexes, query semantics, record identity, and error handling all influence the reliability of the information stored by an application and the overall user experience for people using the application. It also reinforced the importance of selecting constraints based on actual application requirements rather than assumptions about the existing sample data. For example, I considered more restrictive formatting requirements for trip codes but determined that the application's existing records did not support imposing an arbitrary format. Similarly, I retained the existing string representation of trip prices rather than introducing a larger data migration that was not necessary to accomplish the goals of the enhancement. These decisions helped me focus the enhancement on improving data integrity and maintainability while preserving compatibility with the existing application. This update to the application served as a challenging yet fulfilling experience, and I am overall satisfied with the improvements made and the lessons I took away from the time spent on this enhancement.</w:t>
-      </w:r>
-    </w:p>
+    <w:p/>
+    <w:p/>
     <w:sectPr>
       <w:headerReference w:type="default" r:id="rId6"/>
       <w:pgSz w:w="12240" w:h="15840"/>
@@ -501,7 +422,7 @@
       <w:jc w:val="right"/>
     </w:pPr>
     <w:r>
-      <w:t>10/02/26</w:t>
+      <w:t>CS-499</w:t>
     </w:r>
   </w:p>
   <w:p>
@@ -510,7 +431,7 @@
       <w:jc w:val="right"/>
     </w:pPr>
     <w:r>
-      <w:t>CS-499</w:t>
+      <w:t>09/17/26</w:t>
     </w:r>
   </w:p>
   <w:p>
@@ -930,7 +851,7 @@
     <w:link w:val="Heading1Char"/>
     <w:uiPriority w:val="9"/>
     <w:qFormat/>
-    <w:rsid w:val="00AA1C8A"/>
+    <w:rsid w:val="00D7542A"/>
     <w:pPr>
       <w:keepNext/>
       <w:keepLines/>
@@ -953,7 +874,7 @@
     <w:semiHidden/>
     <w:unhideWhenUsed/>
     <w:qFormat/>
-    <w:rsid w:val="00AA1C8A"/>
+    <w:rsid w:val="00D7542A"/>
     <w:pPr>
       <w:keepNext/>
       <w:keepLines/>
@@ -976,7 +897,7 @@
     <w:semiHidden/>
     <w:unhideWhenUsed/>
     <w:qFormat/>
-    <w:rsid w:val="00AA1C8A"/>
+    <w:rsid w:val="00D7542A"/>
     <w:pPr>
       <w:keepNext/>
       <w:keepLines/>
@@ -999,7 +920,7 @@
     <w:semiHidden/>
     <w:unhideWhenUsed/>
     <w:qFormat/>
-    <w:rsid w:val="00AA1C8A"/>
+    <w:rsid w:val="00D7542A"/>
     <w:pPr>
       <w:keepNext/>
       <w:keepLines/>
@@ -1022,7 +943,7 @@
     <w:semiHidden/>
     <w:unhideWhenUsed/>
     <w:qFormat/>
-    <w:rsid w:val="00AA1C8A"/>
+    <w:rsid w:val="00D7542A"/>
     <w:pPr>
       <w:keepNext/>
       <w:keepLines/>
@@ -1043,7 +964,7 @@
     <w:semiHidden/>
     <w:unhideWhenUsed/>
     <w:qFormat/>
-    <w:rsid w:val="00AA1C8A"/>
+    <w:rsid w:val="00D7542A"/>
     <w:pPr>
       <w:keepNext/>
       <w:keepLines/>
@@ -1066,7 +987,7 @@
     <w:semiHidden/>
     <w:unhideWhenUsed/>
     <w:qFormat/>
-    <w:rsid w:val="00AA1C8A"/>
+    <w:rsid w:val="00D7542A"/>
     <w:pPr>
       <w:keepNext/>
       <w:keepLines/>
@@ -1087,7 +1008,7 @@
     <w:semiHidden/>
     <w:unhideWhenUsed/>
     <w:qFormat/>
-    <w:rsid w:val="00AA1C8A"/>
+    <w:rsid w:val="00D7542A"/>
     <w:pPr>
       <w:keepNext/>
       <w:keepLines/>
@@ -1110,7 +1031,7 @@
     <w:semiHidden/>
     <w:unhideWhenUsed/>
     <w:qFormat/>
-    <w:rsid w:val="00AA1C8A"/>
+    <w:rsid w:val="00D7542A"/>
     <w:pPr>
       <w:keepNext/>
       <w:keepLines/>
@@ -1153,7 +1074,7 @@
     <w:basedOn w:val="DefaultParagraphFont"/>
     <w:link w:val="Heading1"/>
     <w:uiPriority w:val="9"/>
-    <w:rsid w:val="00AA1C8A"/>
+    <w:rsid w:val="00D7542A"/>
     <w:rPr>
       <w:rFonts w:asciiTheme="majorHAnsi" w:eastAsiaTheme="majorEastAsia" w:hAnsiTheme="majorHAnsi" w:cstheme="majorBidi"/>
       <w:color w:val="0F4761" w:themeColor="accent1" w:themeShade="BF"/>
@@ -1167,7 +1088,7 @@
     <w:link w:val="Heading2"/>
     <w:uiPriority w:val="9"/>
     <w:semiHidden/>
-    <w:rsid w:val="00AA1C8A"/>
+    <w:rsid w:val="00D7542A"/>
     <w:rPr>
       <w:rFonts w:asciiTheme="majorHAnsi" w:eastAsiaTheme="majorEastAsia" w:hAnsiTheme="majorHAnsi" w:cstheme="majorBidi"/>
       <w:color w:val="0F4761" w:themeColor="accent1" w:themeShade="BF"/>
@@ -1181,7 +1102,7 @@
     <w:link w:val="Heading3"/>
     <w:uiPriority w:val="9"/>
     <w:semiHidden/>
-    <w:rsid w:val="00AA1C8A"/>
+    <w:rsid w:val="00D7542A"/>
     <w:rPr>
       <w:rFonts w:eastAsiaTheme="majorEastAsia" w:cstheme="majorBidi"/>
       <w:color w:val="0F4761" w:themeColor="accent1" w:themeShade="BF"/>
@@ -1195,7 +1116,7 @@
     <w:link w:val="Heading4"/>
     <w:uiPriority w:val="9"/>
     <w:semiHidden/>
-    <w:rsid w:val="00AA1C8A"/>
+    <w:rsid w:val="00D7542A"/>
     <w:rPr>
       <w:rFonts w:eastAsiaTheme="majorEastAsia" w:cstheme="majorBidi"/>
       <w:i/>
@@ -1209,7 +1130,7 @@
     <w:link w:val="Heading5"/>
     <w:uiPriority w:val="9"/>
     <w:semiHidden/>
-    <w:rsid w:val="00AA1C8A"/>
+    <w:rsid w:val="00D7542A"/>
     <w:rPr>
       <w:rFonts w:eastAsiaTheme="majorEastAsia" w:cstheme="majorBidi"/>
       <w:color w:val="0F4761" w:themeColor="accent1" w:themeShade="BF"/>
@@ -1221,7 +1142,7 @@
     <w:link w:val="Heading6"/>
     <w:uiPriority w:val="9"/>
     <w:semiHidden/>
-    <w:rsid w:val="00AA1C8A"/>
+    <w:rsid w:val="00D7542A"/>
     <w:rPr>
       <w:rFonts w:eastAsiaTheme="majorEastAsia" w:cstheme="majorBidi"/>
       <w:i/>
@@ -1235,7 +1156,7 @@
     <w:link w:val="Heading7"/>
     <w:uiPriority w:val="9"/>
     <w:semiHidden/>
-    <w:rsid w:val="00AA1C8A"/>
+    <w:rsid w:val="00D7542A"/>
     <w:rPr>
       <w:rFonts w:eastAsiaTheme="majorEastAsia" w:cstheme="majorBidi"/>
       <w:color w:val="595959" w:themeColor="text1" w:themeTint="A6"/>
@@ -1247,7 +1168,7 @@
     <w:link w:val="Heading8"/>
     <w:uiPriority w:val="9"/>
     <w:semiHidden/>
-    <w:rsid w:val="00AA1C8A"/>
+    <w:rsid w:val="00D7542A"/>
     <w:rPr>
       <w:rFonts w:eastAsiaTheme="majorEastAsia" w:cstheme="majorBidi"/>
       <w:i/>
@@ -1261,7 +1182,7 @@
     <w:link w:val="Heading9"/>
     <w:uiPriority w:val="9"/>
     <w:semiHidden/>
-    <w:rsid w:val="00AA1C8A"/>
+    <w:rsid w:val="00D7542A"/>
     <w:rPr>
       <w:rFonts w:eastAsiaTheme="majorEastAsia" w:cstheme="majorBidi"/>
       <w:color w:val="272727" w:themeColor="text1" w:themeTint="D8"/>
@@ -1274,7 +1195,7 @@
     <w:link w:val="TitleChar"/>
     <w:uiPriority w:val="10"/>
     <w:qFormat/>
-    <w:rsid w:val="00AA1C8A"/>
+    <w:rsid w:val="00D7542A"/>
     <w:pPr>
       <w:spacing w:after="80" w:line="240" w:lineRule="auto"/>
       <w:contextualSpacing/>
@@ -1292,7 +1213,7 @@
     <w:basedOn w:val="DefaultParagraphFont"/>
     <w:link w:val="Title"/>
     <w:uiPriority w:val="10"/>
-    <w:rsid w:val="00AA1C8A"/>
+    <w:rsid w:val="00D7542A"/>
     <w:rPr>
       <w:rFonts w:asciiTheme="majorHAnsi" w:eastAsiaTheme="majorEastAsia" w:hAnsiTheme="majorHAnsi" w:cstheme="majorBidi"/>
       <w:spacing w:val="-10"/>
@@ -1308,7 +1229,7 @@
     <w:link w:val="SubtitleChar"/>
     <w:uiPriority w:val="11"/>
     <w:qFormat/>
-    <w:rsid w:val="00AA1C8A"/>
+    <w:rsid w:val="00D7542A"/>
     <w:pPr>
       <w:numPr>
         <w:ilvl w:val="1"/>
@@ -1327,7 +1248,7 @@
     <w:basedOn w:val="DefaultParagraphFont"/>
     <w:link w:val="Subtitle"/>
     <w:uiPriority w:val="11"/>
-    <w:rsid w:val="00AA1C8A"/>
+    <w:rsid w:val="00D7542A"/>
     <w:rPr>
       <w:rFonts w:eastAsiaTheme="majorEastAsia" w:cstheme="majorBidi"/>
       <w:color w:val="595959" w:themeColor="text1" w:themeTint="A6"/>
@@ -1343,7 +1264,7 @@
     <w:link w:val="QuoteChar"/>
     <w:uiPriority w:val="29"/>
     <w:qFormat/>
-    <w:rsid w:val="00AA1C8A"/>
+    <w:rsid w:val="00D7542A"/>
     <w:pPr>
       <w:spacing w:before="160"/>
       <w:jc w:val="center"/>
@@ -1359,7 +1280,7 @@
     <w:basedOn w:val="DefaultParagraphFont"/>
     <w:link w:val="Quote"/>
     <w:uiPriority w:val="29"/>
-    <w:rsid w:val="00AA1C8A"/>
+    <w:rsid w:val="00D7542A"/>
     <w:rPr>
       <w:i/>
       <w:iCs/>
@@ -1371,7 +1292,7 @@
     <w:basedOn w:val="Normal"/>
     <w:uiPriority w:val="34"/>
     <w:qFormat/>
-    <w:rsid w:val="00AA1C8A"/>
+    <w:rsid w:val="00D7542A"/>
     <w:pPr>
       <w:ind w:left="720"/>
       <w:contextualSpacing/>
@@ -1382,7 +1303,7 @@
     <w:basedOn w:val="DefaultParagraphFont"/>
     <w:uiPriority w:val="21"/>
     <w:qFormat/>
-    <w:rsid w:val="00AA1C8A"/>
+    <w:rsid w:val="00D7542A"/>
     <w:rPr>
       <w:i/>
       <w:iCs/>
@@ -1396,7 +1317,7 @@
     <w:link w:val="IntenseQuoteChar"/>
     <w:uiPriority w:val="30"/>
     <w:qFormat/>
-    <w:rsid w:val="00AA1C8A"/>
+    <w:rsid w:val="00D7542A"/>
     <w:pPr>
       <w:pBdr>
         <w:top w:val="single" w:sz="4" w:space="10" w:color="0F4761" w:themeColor="accent1" w:themeShade="BF"/>
@@ -1417,7 +1338,7 @@
     <w:basedOn w:val="DefaultParagraphFont"/>
     <w:link w:val="IntenseQuote"/>
     <w:uiPriority w:val="30"/>
-    <w:rsid w:val="00AA1C8A"/>
+    <w:rsid w:val="00D7542A"/>
     <w:rPr>
       <w:i/>
       <w:iCs/>
@@ -1429,7 +1350,7 @@
     <w:basedOn w:val="DefaultParagraphFont"/>
     <w:uiPriority w:val="32"/>
     <w:qFormat/>
-    <w:rsid w:val="00AA1C8A"/>
+    <w:rsid w:val="00D7542A"/>
     <w:rPr>
       <w:b/>
       <w:bCs/>
@@ -1444,7 +1365,7 @@
     <w:link w:val="HeaderChar"/>
     <w:uiPriority w:val="99"/>
     <w:unhideWhenUsed/>
-    <w:rsid w:val="00AA1C8A"/>
+    <w:rsid w:val="006803AF"/>
     <w:pPr>
       <w:tabs>
         <w:tab w:val="center" w:pos="4680"/>
@@ -1458,7 +1379,7 @@
     <w:basedOn w:val="DefaultParagraphFont"/>
     <w:link w:val="Header"/>
     <w:uiPriority w:val="99"/>
-    <w:rsid w:val="00AA1C8A"/>
+    <w:rsid w:val="006803AF"/>
   </w:style>
   <w:style w:type="paragraph" w:styleId="Footer">
     <w:name w:val="footer"/>
@@ -1466,7 +1387,7 @@
     <w:link w:val="FooterChar"/>
     <w:uiPriority w:val="99"/>
     <w:unhideWhenUsed/>
-    <w:rsid w:val="00AA1C8A"/>
+    <w:rsid w:val="006803AF"/>
     <w:pPr>
       <w:tabs>
         <w:tab w:val="center" w:pos="4680"/>
@@ -1480,7 +1401,7 @@
     <w:basedOn w:val="DefaultParagraphFont"/>
     <w:link w:val="Footer"/>
     <w:uiPriority w:val="99"/>
-    <w:rsid w:val="00AA1C8A"/>
+    <w:rsid w:val="006803AF"/>
   </w:style>
 </w:styles>
 </file>

</xml_diff>